<commit_message>
TIOS-document: kosten AI eerlijker, en het herstartprobleem genoemd
Co-Authored-By: Claude Opus 5.5 <noreply@anthropic.com>
Claude-Session: https://claude.ai/code/session_01A3eRbSBUPzRtEjLGHCxySe
</commit_message>
<xml_diff>
--- a/docs/Technisch-ontwerp-TIOS-koppeling.docx
+++ b/docs/Technisch-ontwerp-TIOS-koppeling.docx
@@ -773,10 +773,7 @@
                 <w:b/>
                 <w:bCs/>
               </w:rPr>
-              <w:t xml:space="preserve">Een Google-sleutel voor AI (Gemini) op een bedrijfsaccount</w:t>
-            </w:r>
-            <w:r>
-              <w:t xml:space="preserve"> (gratis)</w:t>
+              <w:t xml:space="preserve">Een betaalde Google-sleutel voor AI (Gemini) op een bedrijfsaccount</w:t>
             </w:r>
           </w:p>
         </w:tc>
@@ -798,7 +795,7 @@
           </w:tcPr>
           <w:p>
             <w:r>
-              <w:t xml:space="preserve">De AI leest de voorwaarden uit de regelingen. De sleutel moet van het bedrijf zijn, niet van mij.</w:t>
+              <w:t xml:space="preserve">De AI leest de voorwaarden uit de regelingen. De gratis versie is in de praktijk te beperkt (zie Kosten). De sleutel moet van het bedrijf zijn, niet van mij.</w:t>
             </w:r>
           </w:p>
         </w:tc>
@@ -921,7 +918,22 @@
         <w:t xml:space="preserve">Kosten:</w:t>
       </w:r>
       <w:r>
-        <w:t xml:space="preserve"> € 0 per maand. Alles draait op gratis diensten. Alleen als we later meer AI-gebruik nodig hebben dan gratis kan, kost dat een paar euro per maand.</w:t>
+        <w:t xml:space="preserve"> GitHub, het webadres en de server van TIOS kosten niets extra. Voor de AI is een betaald Google-account nodig. De gratis versie werkt niet goed genoeg: het beste model mag maar zo’n 20 keer per dag en Google is vaak overbelast. Dan duurt het weken voordat alle gemeenten zijn bijgewerkt. De kosten hangen af van het gebruik. We zetten er een budgetgrens op, zodat het nooit meer kost dan afgesproken.</w:t>
+      </w:r>
+    </w:p>
+    <w:p>
+      <w:pPr>
+        <w:spacing w:after="120"/>
+      </w:pPr>
+      <w:r>
+        <w:rPr>
+          <w:b/>
+          <w:bCs/>
+        </w:rPr>
+        <w:t xml:space="preserve">Nog te verbeteren:</w:t>
+      </w:r>
+      <w:r>
+        <w:t xml:space="preserve"> als een update nog niet is goedgekeurd, onthoudt de volgende ronde niet goed waar de vorige gebleven was. Hij doet dan een deel van het werk opnieuw, en dat kost extra AI-aanvragen. Dit wordt opgelost voordat het live gaat.</w:t>
       </w:r>
     </w:p>
     <w:p>

</xml_diff>

<commit_message>
Run gaat verder op een openstaande Subsidie-update
Een nieuwe run begon altijd vanaf main. Was de vorige Subsidie-update nog
niet gemerged, dan deed hij dat werk opnieuw (kost AI-aanvragen) en
overschreef hij de openstaande PR.

- scraper/verder_op_open_update.sh: staat er een open PR op subsidie-update,
  dan worden de gegevens daarvan samengevoegd met main (code blijft van main,
  bij een conflict wint de openstaande update).
- Workflow: die stap vóór de run, volledige git-geschiedenis, en nooit twee
  runs tegelijk.
- run.py: de PR-tekst houdt de wijzigingen van eerdere, nog niet gemergde
  runs.
- README, verbeterplan en TIOS-document bijgewerkt.

Co-Authored-By: Claude Opus 5.5 <noreply@anthropic.com>
Claude-Session: https://claude.ai/code/session_01A3eRbSBUPzRtEjLGHCxySe
</commit_message>
<xml_diff>
--- a/docs/Technisch-ontwerp-TIOS-koppeling.docx
+++ b/docs/Technisch-ontwerp-TIOS-koppeling.docx
@@ -919,21 +919,6 @@
       </w:r>
       <w:r>
         <w:t xml:space="preserve"> GitHub, het webadres en de server van TIOS kosten niets extra. Voor de AI is een betaald Google-account nodig. De gratis versie werkt niet goed genoeg: het beste model mag maar zo’n 20 keer per dag en Google is vaak overbelast. Dan duurt het weken voordat alle gemeenten zijn bijgewerkt. De kosten hangen af van het gebruik. We zetten er een budgetgrens op, zodat het nooit meer kost dan afgesproken.</w:t>
-      </w:r>
-    </w:p>
-    <w:p>
-      <w:pPr>
-        <w:spacing w:after="120"/>
-      </w:pPr>
-      <w:r>
-        <w:rPr>
-          <w:b/>
-          <w:bCs/>
-        </w:rPr>
-        <w:t xml:space="preserve">Nog te verbeteren:</w:t>
-      </w:r>
-      <w:r>
-        <w:t xml:space="preserve"> als een update nog niet is goedgekeurd, onthoudt de volgende ronde niet goed waar de vorige gebleven was. Hij doet dan een deel van het werk opnieuw, en dat kost extra AI-aanvragen. Dit wordt opgelost voordat het live gaat.</w:t>
       </w:r>
     </w:p>
     <w:p>

</xml_diff>

<commit_message>
Checkservice zoekt de gemeente op via postcode + huisnummer (PDOK)
TIOS stuurde de gemeentenaam; 'Den Haag', 'Den Bosch' of een woonplaats
gaf dan ten onrechte 'geen regeling'. Nu zoekt de service met postcode +
huisnummer de gemeente op bij PDOK, dezelfde bron als de subsidielijst.
Bouwjaar en woonoppervlak komen uit het BAG als TIOS ze niet meestuurt.
Is PDOK niet bereikbaar, dan is gemeente= de reserve, met een waarschuwing.

Tests met nagebootste PDOK-antwoorden; documentatie bijgewerkt.

Co-Authored-By: Claude Opus 5.5 <noreply@anthropic.com>
Claude-Session: https://claude.ai/code/session_01A3eRbSBUPzRtEjLGHCxySe
</commit_message>
<xml_diff>
--- a/docs/Technisch-ontwerp-TIOS-koppeling.docx
+++ b/docs/Technisch-ontwerp-TIOS-koppeling.docx
@@ -114,7 +114,7 @@
         <w:spacing w:after="60"/>
       </w:pPr>
       <w:r>
-        <w:t>TIOS stuurt een paar gegevens naar de subsidiecheck: gemeente, energielabel en, als bekend, WOZ-waarde, bouwjaar en of de klant zelf in de woning woont.</w:t>
+        <w:t>TIOS stuurt een paar gegevens naar de subsidiecheck: postcode en huisnummer, energielabel en, als bekend, WOZ-waarde en of de klant zelf in de woning woont. De gemeente en het bouwjaar zoekt de check zelf op via de postcode.</w:t>
       </w:r>
     </w:p>
     <w:p>
@@ -530,7 +530,7 @@
               <w:br/>
             </w:r>
             <w:r>
-              <w:t>naar de online lijst met regelingen</w:t>
+              <w:t>naar de online lijst met regelingen en naar PDOK</w:t>
             </w:r>
           </w:p>
         </w:tc>
@@ -552,7 +552,7 @@
           </w:tcPr>
           <w:p>
             <w:r>
-              <w:t>Zo heeft de check elke dag de nieuwste regelingen. Lukt het een keer niet, dan werkt hij gewoon door met de lijst van de dag ervoor.</w:t>
+              <w:t>Zo heeft de check elke dag de nieuwste regelingen. Lukt het een keer niet, dan werkt hij gewoon door met de lijst van de dag ervoor. Via PDOK (de gratis adresdienst van de overheid) zoekt de check bij een postcode de juiste gemeente op. Alleen postcode en huisnummer gaan daarheen.</w:t>
             </w:r>
           </w:p>
         </w:tc>

</xml_diff>

<commit_message>
Eigenaar-bewoner standaard ja; scraper alleen handmatig starten
- Alle leads van Takkenkamp zijn eigenaar-bewoner. De checkservice en de
  checkpagina gaan daar standaard van uit (instelbaar met
  EIGENAAR_BEWONER_STANDAARD). Een expliciete 'nee' telt nog wel.
- Het dagschema van de workflow is weg: de scraper draait alleen via
  Run workflow.
- Documenten (README, TIOS-koppeling, Word-document, CLAUDE.md) aangepast.

Co-Authored-By: Claude Opus 5.5 <noreply@anthropic.com>
Claude-Session: https://claude.ai/code/session_01A3eRbSBUPzRtEjLGHCxySe
</commit_message>
<xml_diff>
--- a/docs/Technisch-ontwerp-TIOS-koppeling.docx
+++ b/docs/Technisch-ontwerp-TIOS-koppeling.docx
@@ -72,7 +72,7 @@
         <w:ind w:left="160" w:right="120"/>
       </w:pPr>
       <w:r>
-        <w:t>Mogelijk subsidie: Isolatiesubsidie Doesburg (max. € 2.000). Nog checken: eigenaar-bewoner.</w:t>
+        <w:t>Mogelijk subsidie: Isolatiesubsidie Doesburg (max. € 2.000). Nog checken: WOZ-waarde.</w:t>
       </w:r>
     </w:p>
     <w:p>
@@ -114,7 +114,7 @@
         <w:spacing w:after="60"/>
       </w:pPr>
       <w:r>
-        <w:t>TIOS stuurt een paar gegevens naar de subsidiecheck: postcode en huisnummer, energielabel, bouwjaar, woonoppervlak en, als bekend, WOZ-waarde en of de klant zelf in de woning woont. De gemeente zoekt de check zelf op via de postcode.</w:t>
+        <w:t>TIOS stuurt een paar gegevens naar de subsidiecheck: postcode en huisnummer, energielabel, bouwjaar, woonoppervlak en, als bekend, de WOZ-waarde. Onze leads zijn altijd eigenaar-bewoner; daar gaat de check van uit. De gemeente zoekt de check zelf op via de postcode.</w:t>
       </w:r>
     </w:p>
     <w:p>

</xml_diff>